<commit_message>
Recruitment email: v2.1 competency names/order + human-AI teaming emphasis
Doc 6 still listed the pre-v2.1 competency set ("machine teaming and
adaptation" at position 5) in both variants. Update to the v2.1 five in
canonical order — Systems Analysis, Iterative Development, Human-System
Collaboration, Test and Evaluation, Navigating Sociotechnical
Constraints — and give AI a focused shoutout: human-AI teaming named as
a first-class competency (inside Human-System Collaboration), reflecting
how fast that area is moving. Regenerate the .docx shadow via pandoc.

Co-Authored-By: Claude Opus 4.8 <noreply@anthropic.com>
Claude-Session: https://claude.ai/code/session_01BottVLNSMXnmpuNYBYMFKb
</commit_message>
<xml_diff>
--- a/lens_program/6_LENS_Recruitment_Email.docx
+++ b/lens_program/6_LENS_Recruitment_Email.docx
@@ -23,7 +23,7 @@
         <w:pStyle w:val="BodyText"/>
       </w:pPr>
       <w:r>
-        <w:t xml:space="preserve">Two variants for different audiences. Revised June 2026.</w:t>
+        <w:t xml:space="preserve">Two variants for different audiences. Revised August 2026 (v2.1 competency names and order; human-AI teaming emphasis).</w:t>
       </w:r>
     </w:p>
     <w:p>
@@ -87,7 +87,15 @@
         <w:pStyle w:val="BodyText"/>
       </w:pPr>
       <w:r>
-        <w:t xml:space="preserve">The concentration is built around five competencies: seeing the whole system, building and refining interventions iteratively, showing what works through measurement, making solutions survive real-world constraints, and teaming effectively with AI. You can find the full competency framework and curriculum in the materials attached.</w:t>
+        <w:t xml:space="preserve">The concentration is built around five competencies: seeing the whole system; building and refining interventions iteratively; designing human-system collaboration — including human-AI teaming — that keeps people in command; showing what works through measurement; and making solutions survive real-world constraints. You can find the full competency framework and curriculum in the materials attached.</w:t>
+      </w:r>
+    </w:p>
+    <w:p>
+      <w:pPr>
+        <w:pStyle w:val="BodyText"/>
+      </w:pPr>
+      <w:r>
+        <w:t xml:space="preserve">AI runs through all of it. It is reshaping high-consequence work faster than any technology the field has had to absorb, and LENS treats human-AI teaming as a competency in its own right: a partnership designed to make people more capable while keeping them in command — using AI’s reach without offloading the judgment.</w:t>
       </w:r>
     </w:p>
     <w:p>
@@ -199,7 +207,7 @@
         <w:pStyle w:val="BodyText"/>
       </w:pPr>
       <w:r>
-        <w:t xml:space="preserve">Graduates demonstrate five competencies: systems analysis, iterative development, test and evaluation, navigating sociotechnical constraints, and machine teaming and adaptation. The program is a 10-course, 30-credit degree, with a capstone run on a real operational problem. Full details, including the competency framework and course map, are attached.</w:t>
+        <w:t xml:space="preserve">Graduates demonstrate five competencies: systems analysis, iterative development, human-system collaboration, test and evaluation, and navigating sociotechnical constraints. Human-AI teaming sits inside the third and is treated as a first-class concern, not an add-on: as AI reshapes high-consequence work at unusual speed, LENS trains practitioners to design the partnership so it augments human judgment rather than displacing it. The program is a 10-course, 30-credit degree, with a capstone run on a real operational problem. Full details, including the competency framework and course map, are attached.</w:t>
       </w:r>
     </w:p>
     <w:p>

</xml_diff>